<commit_message>
docs(celar-ai): defer private runtime to OpenCloud
</commit_message>
<xml_diff>
--- a/docs/modules/module-011-pulse-ai/architecture/v2.0/US_Signal_Celar_AI_Private_Intelligence_Architecture_v2.0.docx
+++ b/docs/modules/module-011-pulse-ai/architecture/v2.0/US_Signal_Celar_AI_Private_Intelligence_Architecture_v2.0.docx
@@ -1021,6 +1021,65 @@
                 <w:sz w:val="17"/>
               </w:rPr>
               <w:t>Corrected to the supplied US Signal logo, US Signal ownership, Pulse naming, and US Signal visual direction.</w:t>
+            </w:r>
+          </w:p>
+        </w:tc>
+      </w:tr>
+      <w:tr>
+        <w:tc>
+          <w:tcPr>
+            <w:tcW w:type="dxa" w:w="3408"/>
+            <w:vAlign w:val="center"/>
+          </w:tcPr>
+          <w:p>
+            <w:pPr>
+              <w:spacing w:after="40"/>
+            </w:pPr>
+            <w:r>
+              <w:rPr>
+                <w:rFonts w:ascii="Arial" w:hAnsi="Arial"/>
+                <w:b w:val="0"/>
+                <w:sz w:val="17"/>
+              </w:rPr>
+              <w:t>2.0</w:t>
+            </w:r>
+          </w:p>
+        </w:tc>
+        <w:tc>
+          <w:tcPr>
+            <w:tcW w:type="dxa" w:w="3408"/>
+            <w:vAlign w:val="center"/>
+          </w:tcPr>
+          <w:p>
+            <w:pPr>
+              <w:spacing w:after="40"/>
+            </w:pPr>
+            <w:r>
+              <w:rPr>
+                <w:rFonts w:ascii="Arial" w:hAnsi="Arial"/>
+                <w:b w:val="0"/>
+                <w:sz w:val="17"/>
+              </w:rPr>
+              <w:t>2026-08-08</w:t>
+            </w:r>
+          </w:p>
+        </w:tc>
+        <w:tc>
+          <w:tcPr>
+            <w:tcW w:type="dxa" w:w="3408"/>
+            <w:vAlign w:val="center"/>
+          </w:tcPr>
+          <w:p>
+            <w:pPr>
+              <w:spacing w:after="40"/>
+            </w:pPr>
+            <w:r>
+              <w:rPr>
+                <w:rFonts w:ascii="Arial" w:hAnsi="Arial"/>
+                <w:b w:val="0"/>
+                <w:sz w:val="17"/>
+              </w:rPr>
+              <w:t>Added the cost-controlled OpenCloud shared-VM runtime target for Ollama, Tesseract, and ClamAV, including the production scale boundary.</w:t>
             </w:r>
           </w:p>
         </w:tc>
@@ -3145,6 +3204,47 @@
       </w:r>
     </w:p>
     <w:p>
+      <w:r>
+        <w:t>Figure 3. Cost-controlled OpenCloud Test/UAT target with Ollama, Tesseract, and ClamAV isolated on one private runtime VM.</w:t>
+      </w:r>
+    </w:p>
+    <w:p>
+      <w:r>
+        <w:drawing>
+          <wp:inline xmlns:a="http://schemas.openxmlformats.org/drawingml/2006/main" xmlns:pic="http://schemas.openxmlformats.org/drawingml/2006/picture">
+            <wp:extent cx="6400800" cy="3911600"/>
+            <wp:docPr id="4" name="Picture 4"/>
+            <wp:cNvGraphicFramePr>
+              <a:graphicFrameLocks noChangeAspect="1"/>
+            </wp:cNvGraphicFramePr>
+            <a:graphic>
+              <a:graphicData uri="http://schemas.openxmlformats.org/drawingml/2006/picture">
+                <pic:pic>
+                  <pic:nvPicPr>
+                    <pic:cNvPr id="0" name="US_Signal_Celar_AI_OpenCloud_Private_Runtime_Architecture_v2.0.png"/>
+                    <pic:cNvPicPr/>
+                  </pic:nvPicPr>
+                  <pic:blipFill>
+                    <a:blip r:embed="rId14"/>
+                    <a:stretch>
+                      <a:fillRect/>
+                    </a:stretch>
+                  </pic:blipFill>
+                  <pic:spPr>
+                    <a:xfrm>
+                      <a:off x="0" y="0"/>
+                      <a:ext cx="6400800" cy="3911600"/>
+                    </a:xfrm>
+                    <a:prstGeom prst="rect"/>
+                  </pic:spPr>
+                </pic:pic>
+              </a:graphicData>
+            </a:graphic>
+          </wp:inline>
+        </w:drawing>
+      </w:r>
+    </w:p>
+    <w:p>
       <w:pPr/>
       <w:r>
         <w:t>The deployment architecture separates edge and identity, Pulse application services, private data services, private AI services, semantic tools, audit services, and controlled outbound egress.</w:t>
@@ -3166,6 +3266,30 @@
       <w:pPr/>
       <w:r>
         <w:t>External provider traffic originates from the controlled egress gateway and Module 064, not from browsers, documents, or arbitrary application components.</w:t>
+      </w:r>
+    </w:p>
+    <w:p>
+      <w:pPr/>
+      <w:r>
+        <w:t>Current interim state: the additional Azure private-runtime deployment is deferred to avoid temporary infrastructure cost before the planned OpenCloud migration. Pulse structured internal-data intelligence remains independent of the document runtime and continues to use permission-scoped PostgreSQL and governed APIs.</w:t>
+      </w:r>
+    </w:p>
+    <w:p>
+      <w:pPr/>
+      <w:r>
+        <w:t>OpenCloud Test/UAT target: one private Linux VM hosts Ollama, the Tesseract OCR adapter, and ClamAV as three isolated Podman or OCI containers. The VM has no public service ingress; Pulse reaches it only through approved private routing, authenticated service endpoints, and explicit host allowlists.</w:t>
+      </w:r>
+    </w:p>
+    <w:p>
+      <w:pPr/>
+      <w:r>
+        <w:t>The shared runtime VM does not need to host the Pulse web/API application or the Pulse PostgreSQL database. Persistent volumes isolate Ollama models, ClamAV signatures, OCR working files, and service configuration from the containers.</w:t>
+      </w:r>
+    </w:p>
+    <w:p>
+      <w:pPr/>
+      <w:r>
+        <w:t>Production scale boundary: Ollama may move to dedicated GPU-capable compute when latency or concurrency requires it, while Tesseract and ClamAV may remain together on CPU compute. This split changes placement, not the private contracts used by Pulse.</w:t>
       </w:r>
     </w:p>
     <w:p>
@@ -3338,7 +3462,7 @@
     <w:p>
       <w:pPr/>
       <w:r>
-        <w:t>Phase 2 — Private document pipeline: scanning, extraction, OCR, classification, versioning, citations, private embeddings, and permission-filtered retrieval.</w:t>
+        <w:t>Phase 2 — OpenCloud private document runtime: provision the shared Test/UAT VM, deploy Ollama, Tesseract, and ClamAV containers, configure private routing and secrets, then enable scanning, extraction, OCR, classification, citations, private embeddings, and permission-filtered retrieval.</w:t>
       </w:r>
     </w:p>
     <w:p>
@@ -3531,7 +3655,7 @@
                 <w:b w:val="0"/>
                 <w:sz w:val="17"/>
               </w:rPr>
-              <w:t>Private extraction and RAG</w:t>
+              <w:t>OpenCloud shared private runtime and RAG</w:t>
             </w:r>
           </w:p>
         </w:tc>
@@ -3551,7 +3675,7 @@
                 <w:b w:val="0"/>
                 <w:sz w:val="17"/>
               </w:rPr>
-              <w:t>Privacy and retrieval tests</w:t>
+              <w:t>Private network, service probes, privacy and retrieval tests</w:t>
             </w:r>
           </w:p>
         </w:tc>
@@ -3672,7 +3796,7 @@
                 <w:b w:val="0"/>
                 <w:sz w:val="17"/>
               </w:rPr>
-              <w:t>Deterministic tool integration</w:t>
+              <w:t>Cited SOW evidence and deterministic tool integration</w:t>
             </w:r>
           </w:p>
         </w:tc>
@@ -4810,6 +4934,68 @@
           </w:p>
         </w:tc>
       </w:tr>
+      <w:tr>
+        <w:tc>
+          <w:tcPr>
+            <w:tcW w:type="dxa" w:w="3408"/>
+            <w:vAlign w:val="center"/>
+            <w:shd w:fill="F2F5F7"/>
+          </w:tcPr>
+          <w:p>
+            <w:pPr>
+              <w:spacing w:after="40"/>
+            </w:pPr>
+            <w:r>
+              <w:rPr>
+                <w:rFonts w:ascii="Arial" w:hAnsi="Arial"/>
+                <w:b w:val="0"/>
+                <w:sz w:val="17"/>
+              </w:rPr>
+              <w:t>ADR-006</w:t>
+            </w:r>
+          </w:p>
+        </w:tc>
+        <w:tc>
+          <w:tcPr>
+            <w:tcW w:type="dxa" w:w="3408"/>
+            <w:vAlign w:val="center"/>
+            <w:shd w:fill="F2F5F7"/>
+          </w:tcPr>
+          <w:p>
+            <w:pPr>
+              <w:spacing w:after="40"/>
+            </w:pPr>
+            <w:r>
+              <w:rPr>
+                <w:rFonts w:ascii="Arial" w:hAnsi="Arial"/>
+                <w:b w:val="0"/>
+                <w:sz w:val="17"/>
+              </w:rPr>
+              <w:t>OpenCloud shared Test/UAT runtime</w:t>
+            </w:r>
+          </w:p>
+        </w:tc>
+        <w:tc>
+          <w:tcPr>
+            <w:tcW w:type="dxa" w:w="3408"/>
+            <w:vAlign w:val="center"/>
+            <w:shd w:fill="F2F5F7"/>
+          </w:tcPr>
+          <w:p>
+            <w:pPr>
+              <w:spacing w:after="40"/>
+            </w:pPr>
+            <w:r>
+              <w:rPr>
+                <w:rFonts w:ascii="Arial" w:hAnsi="Arial"/>
+                <w:b w:val="0"/>
+                <w:sz w:val="17"/>
+              </w:rPr>
+              <w:t>Ollama, Tesseract, and ClamAV share one private VM as isolated containers until scale justifies separate compute.</w:t>
+            </w:r>
+          </w:p>
+        </w:tc>
+      </w:tr>
     </w:tbl>
     <w:p/>
     <w:p>
@@ -5207,6 +5393,46 @@
           </w:p>
         </w:tc>
       </w:tr>
+      <w:tr>
+        <w:tc>
+          <w:tcPr>
+            <w:tcW w:type="dxa" w:w="5112"/>
+            <w:vAlign w:val="center"/>
+          </w:tcPr>
+          <w:p>
+            <w:pPr>
+              <w:spacing w:after="40"/>
+            </w:pPr>
+            <w:r>
+              <w:rPr>
+                <w:rFonts w:ascii="Arial" w:hAnsi="Arial"/>
+                <w:b w:val="0"/>
+                <w:sz w:val="17"/>
+              </w:rPr>
+              <w:t>OpenCloud runtime VM</w:t>
+            </w:r>
+          </w:p>
+        </w:tc>
+        <w:tc>
+          <w:tcPr>
+            <w:tcW w:type="dxa" w:w="5112"/>
+            <w:vAlign w:val="center"/>
+          </w:tcPr>
+          <w:p>
+            <w:pPr>
+              <w:spacing w:after="40"/>
+            </w:pPr>
+            <w:r>
+              <w:rPr>
+                <w:rFonts w:ascii="Arial" w:hAnsi="Arial"/>
+                <w:b w:val="0"/>
+                <w:sz w:val="17"/>
+              </w:rPr>
+              <w:t>Private Test/UAT Linux host for separate Ollama, Tesseract OCR, and ClamAV containers; Pulse application and database placement remains independent.</w:t>
+            </w:r>
+          </w:p>
+        </w:tc>
+      </w:tr>
     </w:tbl>
     <w:p/>
     <w:sectPr>

</xml_diff>